<commit_message>
Port Douglas and Hawthorn Rd Rev G: drone photogrammetry capability and experience
Co-Authored-By: Claude Opus 5.5 <noreply@anthropic.com>
Claude-Session: https://claude.ai/code/session_01RKGFyarCMuMinKYL7AiBap
</commit_message>
<xml_diff>
--- a/FP/VP523438/Final/JCE_FP_VP523438_Final_RevG.docx
+++ b/FP/VP523438/Final/JCE_FP_VP523438_Final_RevG.docx
@@ -3750,6 +3750,7 @@
           </w:tcPr>
           <w:p>
             <w:pPr>
+              <w:keepNext/>
               <w:spacing w:after="20"/>
             </w:pPr>
             <w:r/>
@@ -3769,6 +3770,7 @@
           </w:tcPr>
           <w:p>
             <w:pPr>
+              <w:keepNext/>
               <w:spacing w:after="20"/>
             </w:pPr>
             <w:r/>
@@ -3788,6 +3790,7 @@
           </w:tcPr>
           <w:p>
             <w:pPr>
+              <w:keepNext/>
               <w:spacing w:after="20"/>
             </w:pPr>
             <w:r/>
@@ -3798,6 +3801,68 @@
                 <w:sz w:val="18"/>
               </w:rPr>
               <w:t>[TBC - Jayden: client contact]</w:t>
+            </w:r>
+          </w:p>
+        </w:tc>
+      </w:tr>
+      <w:tr>
+        <w:trPr>
+          <w:cantSplit/>
+        </w:trPr>
+        <w:tc>
+          <w:tcPr>
+            <w:tcW w:type="dxa" w:w="3402"/>
+          </w:tcPr>
+          <w:p>
+            <w:pPr>
+              <w:spacing w:after="20"/>
+            </w:pPr>
+            <w:r/>
+            <w:r>
+              <w:rPr>
+                <w:b w:val="0"/>
+                <w:i w:val="0"/>
+                <w:sz w:val="18"/>
+              </w:rPr>
+              <w:t>Farm drainage works, private rural client (Craig Sullivan).</w:t>
+            </w:r>
+          </w:p>
+        </w:tc>
+        <w:tc>
+          <w:tcPr>
+            <w:tcW w:type="dxa" w:w="3685"/>
+          </w:tcPr>
+          <w:p>
+            <w:pPr>
+              <w:spacing w:after="20"/>
+            </w:pPr>
+            <w:r/>
+            <w:r>
+              <w:rPr>
+                <w:b w:val="0"/>
+                <w:i w:val="0"/>
+                <w:sz w:val="18"/>
+              </w:rPr>
+              <w:t>Drone photogrammetry survey of the property using RTK-positioned automated flights, processed in Autodesk ReCap Pro to a terrain surface used to design the drainage works.</w:t>
+            </w:r>
+          </w:p>
+        </w:tc>
+        <w:tc>
+          <w:tcPr>
+            <w:tcW w:type="dxa" w:w="2551"/>
+          </w:tcPr>
+          <w:p>
+            <w:pPr>
+              <w:spacing w:after="20"/>
+            </w:pPr>
+            <w:r/>
+            <w:r>
+              <w:rPr>
+                <w:b w:val="0"/>
+                <w:i w:val="0"/>
+                <w:sz w:val="18"/>
+              </w:rPr>
+              <w:t>Craig Sullivan, private client. Referee details available on request.</w:t>
             </w:r>
           </w:p>
         </w:tc>

</xml_diff>

<commit_message>
Newstead VP527574 Rev G: drone capability
Co-Authored-By: Claude Opus 5.5 <noreply@anthropic.com>
Claude-Session: https://claude.ai/code/session_01RKGFyarCMuMinKYL7AiBap
</commit_message>
<xml_diff>
--- a/FP/VP523438/Final/JCE_FP_VP523438_Final_RevG.docx
+++ b/FP/VP523438/Final/JCE_FP_VP523438_Final_RevG.docx
@@ -1829,7 +1829,7 @@
           <w:b w:val="0"/>
           <w:i w:val="0"/>
         </w:rPr>
-        <w:t>Start-up meeting with Council and a two-day site appraisal of the whole corridor: drainage lines, culvert condition, verges, accesses, stobie poles, trees and interfaces, with a photo log (by 04/12/2026). JCE will also fly the corridor with its RTK drone and process the capture in Autodesk ReCap Pro into an orthophoto and a terrain surface of existing conditions (verges, accesses, culvert inlets and outlets, trees and stobie poles); the ReCap surface feeds the InfraWorks and Civil 3D concept design model as context for the options and workshops, and supplements the engineering survey without replacing it.</w:t>
+        <w:t>Start-up meeting with Council and a two-day site appraisal of the whole corridor: drainage lines, culvert condition, verges, accesses, stobie poles, trees and interfaces, with a photo log (by 04/12/2026). JCE will also fly the corridor with its RTK drone and process the capture in Autodesk ReCap Pro into an orthophoto and a terrain surface of existing conditions (verges, accesses, culvert inlets and outlets, trees and stobie poles); the ReCap surface feeds the InfraWorks and Civil 3D concept design model as context for the options and workshops, and supplements the engineering survey without replacing it. High-resolution aerial stills and video from the same flights form part of the existing-condition record and are used in Council's workshop presentations.</w:t>
       </w:r>
     </w:p>
     <w:p>
@@ -2231,6 +2231,18 @@
           <w:i w:val="0"/>
         </w:rPr>
         <w:t>Appendices: engineering survey, geotechnical and pavement design report, Tree Assessment Report and lighting concept</w:t>
+      </w:r>
+    </w:p>
+    <w:p>
+      <w:pPr>
+        <w:pStyle w:val="ListBullet"/>
+      </w:pPr>
+      <w:r>
+        <w:rPr>
+          <w:b w:val="0"/>
+          <w:i w:val="0"/>
+        </w:rPr>
+        <w:t>Drone orthophoto and high-resolution aerial stills and video of existing conditions along the corridor (digital files)</w:t>
       </w:r>
     </w:p>
     <w:p>
@@ -2958,7 +2970,7 @@
           <w:b w:val="0"/>
           <w:i w:val="0"/>
         </w:rPr>
-        <w:t>Jayden has delivered drone photogrammetry on previous projects, planning automated flight paths in DroneDeploy, capturing with RTK positioning, and processing in Autodesk ReCap Pro to build point clouds and terrain surfaces for use in Autodesk InfraWorks and civil design models.</w:t>
+        <w:t>Jayden has delivered drone photogrammetry on previous projects, planning automated flight paths in DroneDeploy, capturing RTK-positioned photogrammetry and high-resolution aerial stills and video, and processing in Autodesk ReCap Pro to build point clouds and terrain surfaces for use in Autodesk InfraWorks and civil design models.</w:t>
       </w:r>
     </w:p>
     <w:p>

</xml_diff>

<commit_message>
Inner West Rev G and WIP outputs
Co-Authored-By: Claude Opus 5.5 <noreply@anthropic.com>
Claude-Session: https://claude.ai/code/session_01RKGFyarCMuMinKYL7AiBap
</commit_message>
<xml_diff>
--- a/FP/VP523438/Final/JCE_FP_VP523438_Final_RevG.docx
+++ b/FP/VP523438/Final/JCE_FP_VP523438_Final_RevG.docx
@@ -3837,7 +3837,7 @@
                 <w:i w:val="0"/>
                 <w:sz w:val="18"/>
               </w:rPr>
-              <w:t>JCE, flood levee inspection and certification, 6887 Oxley Highway, Gunnedah NSW (2026). Earthen levee about 647 m long.</w:t>
+              <w:t>RAAF Base Townsville, Defence delivery project: engineering delivery for CPB Contractors (head contractor).</w:t>
             </w:r>
           </w:p>
         </w:tc>
@@ -3857,7 +3857,7 @@
                 <w:i w:val="0"/>
                 <w:sz w:val="18"/>
               </w:rPr>
-              <w:t>Condition inspection, field dispersion and plasticity testing, and certification report JCE-INS-001 for a development application.</w:t>
+              <w:t>Delivery with a tier-one head contractor on a Queensland Defence base, including construction phase work.</w:t>
             </w:r>
           </w:p>
         </w:tc>
@@ -3877,7 +3877,7 @@
                 <w:i w:val="0"/>
                 <w:sz w:val="18"/>
               </w:rPr>
-              <w:t>[TBC - Jayden: client contact]</w:t>
+              <w:t>Maverick Partner, CPB Contractors. Contact details available on request.</w:t>
             </w:r>
           </w:p>
         </w:tc>

</xml_diff>